<commit_message>
Make example deliverables reproducible and refresh them
- scripts/make_examples.py regenerates every published example from one
  fictional dataset chosen to exercise the interesting paths: multi-year
  history, completed actions, consultant notes, executive quote
- examples/ refreshed: the PDF now carries the glossary annex (18 p.),
  and the questionnaire ships alongside the five documents
- README documents the script
</commit_message>
<xml_diff>
--- a/examples/Rapport-ESG.docx
+++ b/examples/Rapport-ESG.docx
@@ -201,7 +201,7 @@
                 <w:color w:val="8E44AD"/>
                 <w:sz w:val="48"/>
               </w:rPr>
-              <w:t>68.3</w:t>
+              <w:t>75.0</w:t>
             </w:r>
           </w:p>
         </w:tc>
@@ -219,7 +219,7 @@
                 <w:color w:val="F39C12"/>
                 <w:sz w:val="48"/>
               </w:rPr>
-              <w:t>64.3</w:t>
+              <w:t>66.0</w:t>
             </w:r>
           </w:p>
         </w:tc>
@@ -237,7 +237,7 @@
           <w:color w:val="F39C12"/>
           <w:sz w:val="32"/>
         </w:rPr>
-        <w:t>Note : BBB</w:t>
+        <w:t>Note : A</w:t>
       </w:r>
     </w:p>
     <w:p>
@@ -310,7 +310,7 @@
         <w:spacing w:after="240"/>
       </w:pPr>
       <w:r>
-        <w:t>Acme Industries consolide pour l'exercice 2025 son reporting de durabilité, ancré dans les réalités de l'industrie manufacturière, au cœur des défis d'efficacité carbone. Avec 64.3/100 et une note BBB, Acme Industries affiche une performance satisfaisante avec des marges de progression identifiées sur l'ensemble du périmètre extra-financier. Environnemental domine le profil ESG (70/100) tandis que Social (55/100) constitue la marge d'amélioration prioritaire. Au global, le profil se situe 9 pts au-dessus de la référence sectorielle, avec une maturité ESG évaluée comme structurée (2/5). Combler les lacunes de reporting prioritaires — au premier rang desquelles la vérification par un tiers indépendant, requise par la CSRD (assurance limitée) — constitue le levier le plus rapide pour sécuriser la conformité CSRD et renforcer la confiance des investisseurs. Par rapport à l'exercice 2024, le score global progresse de 9 points (environnement +12, social +3, gouvernance +10). Depuis le précédent plan d'action, une action a été menée à bien, dont « Créer un comité de durabilité au conseil » — preuve tangible que la feuille de route est exécutée. Cette démarche s'appuie sur des initiatives déjà engagées, notamment le programme Cap Climat 2027 et l'installation photovoltaïque du site de Lyon.</w:t>
+        <w:t>Acme Industries consolide pour l'exercice 2025 son reporting de durabilité, ancré dans les réalités de l'industrie manufacturière, au cœur des défis d'efficacité carbone. Avec 66.0/100 et une note A, Acme Industries affiche une bonne performance, nettement au-dessus de la moyenne sectorielle sur l'ensemble du périmètre extra-financier. Gouvernance domine le profil ESG (75/100) tandis que Social (55/100) constitue la marge d'amélioration prioritaire. Au global, le profil se situe 11 pts au-dessus de la référence sectorielle, avec une maturité ESG évaluée comme structurée (2/5). Combler les lacunes de reporting prioritaires — au premier rang desquelles la vérification par un tiers indépendant, requise par la CSRD (assurance limitée) — constitue le levier le plus rapide pour sécuriser la conformité CSRD et renforcer la confiance des investisseurs. Par rapport à l'exercice 2024, le score global progresse de 10 points (environnement +12, social +5, gouvernance +15). Depuis le précédent plan d'action, deux actions ont été menées à bien, dont « Créer un comité de durabilité au conseil » et « Porter la formation à 20h/employé/an minimum » — preuve tangible que la feuille de route est exécutée. Cette démarche s'appuie sur des initiatives déjà engagées, notamment le programme Cap Climat 2027 et l'installation photovoltaïque du site de Lyon.</w:t>
       </w:r>
     </w:p>
     <w:p>
@@ -337,7 +337,7 @@
           <w:color w:val="1B3A6B"/>
           <w:sz w:val="20"/>
         </w:rPr>
-        <w:t>Priorité 2026 : fiabiliser le reporting énergie avant l'audit de certification prévu au T3. Le reste de la trajectoire est tenu.</w:t>
+        <w:t>La priorité 2026 est la fiabilisation du reporting énergie avant l'audit de certification prévu au troisième trimestre.</w:t>
       </w:r>
     </w:p>
     <w:p>
@@ -400,7 +400,7 @@
           <w:color w:val="1B3A6B"/>
           <w:sz w:val="20"/>
         </w:rPr>
-        <w:t>Le site de Lyon concentre 70 % des émissions du périmètre : c'est là que se joue la trajectoire carbone.</w:t>
+        <w:t>Le site de Lyon concentre près de 70 % des émissions du périmètre : c'est là que se joue la trajectoire.</w:t>
       </w:r>
     </w:p>
     <w:p>
@@ -425,7 +425,7 @@
         <w:spacing w:after="160"/>
       </w:pPr>
       <w:r>
-        <w:t>Le bilan environnemental de Acme Industries aboutit à un score de 70/100. Les indicateurs recensés couvrent : 8,200 t CO₂e totales (intensité : 170.8 t/M€ CA) ; reporting carbone complet : opérationnel 1,200 t, énergie 2,100 t, chaîne de valeur 4,900 t ; 42% d'énergie renouvelable (progression engagée) ; 14,500 MWh consommés ; 120,000 m³ prélevés ; recyclage 63% (satisfaisant). L'axe de progrès prioritaire porte sur l'optimisation de son empreinte industrielle, en cohérence avec les exigences sectorielles. Le pilier se situe 18 pts au-dessus de la référence sectorielle interne et couvre les principales exigences des normes ESRS E1 (climat) et E5 (économie circulaire).</w:t>
+        <w:t>Le bilan environnemental de Acme Industries aboutit à un score de 70/100. Les indicateurs recensés couvrent : 8,200 t CO₂e totales (intensité : 170.8 t/M€ CA) ; reporting carbone complet : opérationnel 1,200 t, énergie 2,100 t, chaîne de valeur 4,900 t ; 42% d'énergie renouvelable (progression engagée) ; 21,500 MWh consommés ; 120,000 m³ prélevés ; recyclage 63% (satisfaisant). L'axe de progrès prioritaire porte sur l'optimisation de son empreinte industrielle, en cohérence avec les exigences sectorielles. Le pilier se situe 18 pts au-dessus de la référence sectorielle interne et couvre les principales exigences des normes ESRS E1 (climat) et E5 (économie circulaire).</w:t>
       </w:r>
     </w:p>
     <w:tbl>
@@ -549,7 +549,7 @@
                 <w:color w:val="1B3A6B"/>
                 <w:sz w:val="32"/>
               </w:rPr>
-              <w:t>14,500</w:t>
+              <w:t>21,500</w:t>
             </w:r>
           </w:p>
         </w:tc>
@@ -868,7 +868,7 @@
         <w:spacing w:after="160"/>
       </w:pPr>
       <w:r>
-        <w:t>Acme Industries enregistre 55/100 sur l'axe social de son reporting extra-financier. Le bilan social présente : 320 collaborateurs (France) ; 34% de femmes (écart 6 pts vs. objectif 40%) ; 22 h/an de formation par collaborateur (satisfaisant) ; taux de fréquence accidents 6.2 (à améliorer en priorité) ; turnover 13%. La démarche sociale combine montée en compétences, dialogue social renforcé et inclusion durable. Le pilier se situe 1 pt en retrait de la référence sectorielle interne ; le reporting s'inscrit dans le périmètre de la norme ESRS S1 (effectifs propres).</w:t>
+        <w:t>Acme Industries enregistre 55/100 sur l'axe social de son reporting extra-financier. Le bilan social présente : 320 collaborateurs (France) ; 34% de femmes (écart 6 pts vs. objectif 40%) ; 22 h/an de formation par collaborateur (satisfaisant) ; taux de fréquence accidents 6.2 (à améliorer en priorité) ; turnover 11%. La démarche sociale combine montée en compétences, dialogue social renforcé et inclusion durable. Le pilier se situe 1 pt en retrait de la référence sectorielle interne ; le reporting s'inscrit dans le périmètre de la norme ESRS S1 (effectifs propres).</w:t>
       </w:r>
     </w:p>
     <w:tbl>
@@ -992,7 +992,7 @@
                 <w:color w:val="1B3A6B"/>
                 <w:sz w:val="32"/>
               </w:rPr>
-              <w:t>13.0%</w:t>
+              <w:t>11.0%</w:t>
             </w:r>
           </w:p>
         </w:tc>
@@ -1162,6 +1162,33 @@
       </w:r>
     </w:p>
     <w:p>
+      <w:pPr>
+        <w:spacing w:before="120" w:after="20"/>
+      </w:pPr>
+      <w:r>
+        <w:rPr>
+          <w:b/>
+          <w:color w:val="F39C12"/>
+          <w:sz w:val="17"/>
+        </w:rPr>
+        <w:t>L'ANALYSE DU CONSULTANT</w:t>
+      </w:r>
+    </w:p>
+    <w:p>
+      <w:pPr>
+        <w:shd w:val="clear" w:fill="EBF2FB"/>
+        <w:spacing w:after="160"/>
+      </w:pPr>
+      <w:r>
+        <w:rPr>
+          <w:i/>
+          <w:color w:val="1B3A6B"/>
+          <w:sz w:val="20"/>
+        </w:rPr>
+        <w:t>Le comité de durabilité fonctionne, mais doit formaliser ses comptes rendus pour être opposable lors de la vérification.</w:t>
+      </w:r>
+    </w:p>
+    <w:p>
       <w:r>
         <w:rPr>
           <w:b/>
@@ -1175,7 +1202,7 @@
           <w:color w:val="8E44AD"/>
           <w:sz w:val="28"/>
         </w:rPr>
-        <w:t>68.3/100</w:t>
+        <w:t>75.0/100</w:t>
       </w:r>
     </w:p>
     <w:p>
@@ -1183,7 +1210,7 @@
         <w:spacing w:after="160"/>
       </w:pPr>
       <w:r>
-        <w:t>Acme Industries positionne son axe Gouvernance à 68/100. L'architecture de gouvernance comprend : CA de 7 membres ; 29% de femmes au CA (11 pts sous l'objectif Rixain 40%) ; 45% d'administrateurs indépendants (sous le seuil AFEP-MEDEF 50%) ; aucun manquement éthique enregistré ; un incident cybersécurité déclaré. Le déploiement d'une certification ESG externe constitue un axe de progrès à court terme. La supervision ESG est assurée par un comité dédié qui rend compte directement au Conseil. Le pilier se situe 10 pts au-dessus de la référence sectorielle interne ; le dispositif répond aux attendus des normes ESRS G1 (conduite des affaires) et ESRS 2 (gouvernance des enjeux de durabilité).</w:t>
+        <w:t>Acme Industries positionne son axe Gouvernance à 75/100. L'architecture de gouvernance comprend : CA de 9 membres ; 44% de femmes au CA (conforme loi Rixain (≥40%)) ; 45% d'administrateurs indépendants (sous le seuil AFEP-MEDEF 50%) ; aucun manquement éthique enregistré ; un incident cybersécurité déclaré. Le déploiement d'une certification ESG externe constitue un axe de progrès à court terme. La supervision ESG est assurée par un comité dédié qui rend compte directement au Conseil. Le pilier se situe 17 pts au-dessus de la référence sectorielle interne ; le dispositif répond aux attendus des normes ESRS G1 (conduite des affaires) et ESRS 2 (gouvernance des enjeux de durabilité).</w:t>
       </w:r>
     </w:p>
     <w:tbl>
@@ -1271,7 +1298,7 @@
                 <w:color w:val="1B3A6B"/>
                 <w:sz w:val="32"/>
               </w:rPr>
-              <w:t>7</w:t>
+              <w:t>9</w:t>
             </w:r>
           </w:p>
         </w:tc>
@@ -1289,7 +1316,7 @@
                 <w:color w:val="1B3A6B"/>
                 <w:sz w:val="32"/>
               </w:rPr>
-              <w:t>29.0%</w:t>
+              <w:t>44.0%</w:t>
             </w:r>
           </w:p>
         </w:tc>
@@ -1493,46 +1520,6 @@
     </w:p>
     <w:p>
       <w:pPr>
-        <w:spacing w:after="160"/>
-        <w:jc w:val="center"/>
-      </w:pPr>
-      <w:r>
-        <w:drawing>
-          <wp:inline xmlns:a="http://schemas.openxmlformats.org/drawingml/2006/main" xmlns:pic="http://schemas.openxmlformats.org/drawingml/2006/picture">
-            <wp:extent cx="4320000" cy="2617781"/>
-            <wp:docPr id="1" name="Picture 1"/>
-            <wp:cNvGraphicFramePr>
-              <a:graphicFrameLocks noChangeAspect="1"/>
-            </wp:cNvGraphicFramePr>
-            <a:graphic>
-              <a:graphicData uri="http://schemas.openxmlformats.org/drawingml/2006/picture">
-                <pic:pic>
-                  <pic:nvPicPr>
-                    <pic:cNvPr id="0" name="image.png"/>
-                    <pic:cNvPicPr/>
-                  </pic:nvPicPr>
-                  <pic:blipFill>
-                    <a:blip r:embed="rId9"/>
-                    <a:stretch>
-                      <a:fillRect/>
-                    </a:stretch>
-                  </pic:blipFill>
-                  <pic:spPr>
-                    <a:xfrm>
-                      <a:off x="0" y="0"/>
-                      <a:ext cx="4320000" cy="2617781"/>
-                    </a:xfrm>
-                    <a:prstGeom prst="rect"/>
-                  </pic:spPr>
-                </pic:pic>
-              </a:graphicData>
-            </a:graphic>
-          </wp:inline>
-        </w:drawing>
-      </w:r>
-    </w:p>
-    <w:p>
-      <w:pPr>
         <w:spacing w:before="280" w:after="120"/>
         <w:jc w:val="left"/>
       </w:pPr>
@@ -1556,86 +1543,6 @@
     </w:p>
     <w:p>
       <w:pPr>
-        <w:spacing w:after="160"/>
-        <w:jc w:val="center"/>
-      </w:pPr>
-      <w:r>
-        <w:drawing>
-          <wp:inline xmlns:a="http://schemas.openxmlformats.org/drawingml/2006/main" xmlns:pic="http://schemas.openxmlformats.org/drawingml/2006/picture">
-            <wp:extent cx="5400000" cy="2814406"/>
-            <wp:docPr id="2" name="Picture 2"/>
-            <wp:cNvGraphicFramePr>
-              <a:graphicFrameLocks noChangeAspect="1"/>
-            </wp:cNvGraphicFramePr>
-            <a:graphic>
-              <a:graphicData uri="http://schemas.openxmlformats.org/drawingml/2006/picture">
-                <pic:pic>
-                  <pic:nvPicPr>
-                    <pic:cNvPr id="0" name="image.png"/>
-                    <pic:cNvPicPr/>
-                  </pic:nvPicPr>
-                  <pic:blipFill>
-                    <a:blip r:embed="rId10"/>
-                    <a:stretch>
-                      <a:fillRect/>
-                    </a:stretch>
-                  </pic:blipFill>
-                  <pic:spPr>
-                    <a:xfrm>
-                      <a:off x="0" y="0"/>
-                      <a:ext cx="5400000" cy="2814406"/>
-                    </a:xfrm>
-                    <a:prstGeom prst="rect"/>
-                  </pic:spPr>
-                </pic:pic>
-              </a:graphicData>
-            </a:graphic>
-          </wp:inline>
-        </w:drawing>
-      </w:r>
-    </w:p>
-    <w:p>
-      <w:pPr>
-        <w:spacing w:after="160"/>
-        <w:jc w:val="center"/>
-      </w:pPr>
-      <w:r>
-        <w:drawing>
-          <wp:inline xmlns:a="http://schemas.openxmlformats.org/drawingml/2006/main" xmlns:pic="http://schemas.openxmlformats.org/drawingml/2006/picture">
-            <wp:extent cx="5400000" cy="2668074"/>
-            <wp:docPr id="3" name="Picture 3"/>
-            <wp:cNvGraphicFramePr>
-              <a:graphicFrameLocks noChangeAspect="1"/>
-            </wp:cNvGraphicFramePr>
-            <a:graphic>
-              <a:graphicData uri="http://schemas.openxmlformats.org/drawingml/2006/picture">
-                <pic:pic>
-                  <pic:nvPicPr>
-                    <pic:cNvPr id="0" name="image.png"/>
-                    <pic:cNvPicPr/>
-                  </pic:nvPicPr>
-                  <pic:blipFill>
-                    <a:blip r:embed="rId11"/>
-                    <a:stretch>
-                      <a:fillRect/>
-                    </a:stretch>
-                  </pic:blipFill>
-                  <pic:spPr>
-                    <a:xfrm>
-                      <a:off x="0" y="0"/>
-                      <a:ext cx="5400000" cy="2668074"/>
-                    </a:xfrm>
-                    <a:prstGeom prst="rect"/>
-                  </pic:spPr>
-                </pic:pic>
-              </a:graphicData>
-            </a:graphic>
-          </wp:inline>
-        </w:drawing>
-      </w:r>
-    </w:p>
-    <w:p>
-      <w:pPr>
         <w:spacing w:before="280" w:after="120"/>
         <w:jc w:val="left"/>
       </w:pPr>
@@ -1655,46 +1562,6 @@
       </w:pPr>
       <w:r>
         <w:t>Au titre du règlement Taxonomie de l'Union européenne, Acme Industries déclare la part de ses activités durables sur le plan environnemental : 38% du chiffre d'affaires, 52% des CapEx, 20% des OpEx alignés. Ces indicateurs traduisent la contribution substantielle des activités à au moins un objectif environnemental, dans le respect du principe DNSH (« ne pas causer de préjudice important ») et des garanties minimales sociales. Le CapEx aligné, prospectif, reflète la trajectoire d'investissement de l'entreprise vers une économie bas-carbone.</w:t>
-      </w:r>
-    </w:p>
-    <w:p>
-      <w:pPr>
-        <w:spacing w:after="160"/>
-        <w:jc w:val="center"/>
-      </w:pPr>
-      <w:r>
-        <w:drawing>
-          <wp:inline xmlns:a="http://schemas.openxmlformats.org/drawingml/2006/main" xmlns:pic="http://schemas.openxmlformats.org/drawingml/2006/picture">
-            <wp:extent cx="5040000" cy="2244553"/>
-            <wp:docPr id="4" name="Picture 4"/>
-            <wp:cNvGraphicFramePr>
-              <a:graphicFrameLocks noChangeAspect="1"/>
-            </wp:cNvGraphicFramePr>
-            <a:graphic>
-              <a:graphicData uri="http://schemas.openxmlformats.org/drawingml/2006/picture">
-                <pic:pic>
-                  <pic:nvPicPr>
-                    <pic:cNvPr id="0" name="image.png"/>
-                    <pic:cNvPicPr/>
-                  </pic:nvPicPr>
-                  <pic:blipFill>
-                    <a:blip r:embed="rId12"/>
-                    <a:stretch>
-                      <a:fillRect/>
-                    </a:stretch>
-                  </pic:blipFill>
-                  <pic:spPr>
-                    <a:xfrm>
-                      <a:off x="0" y="0"/>
-                      <a:ext cx="5040000" cy="2244553"/>
-                    </a:xfrm>
-                    <a:prstGeom prst="rect"/>
-                  </pic:spPr>
-                </pic:pic>
-              </a:graphicData>
-            </a:graphic>
-          </wp:inline>
-        </w:drawing>
       </w:r>
     </w:p>
     <w:p>
@@ -1758,7 +1625,7 @@
           <w:color w:val="F39C12"/>
           <w:sz w:val="25"/>
         </w:rPr>
-        <w:t>3 forces établies, 5 leviers de progression</w:t>
+        <w:t>5 forces établies, 5 leviers de progression</w:t>
       </w:r>
     </w:p>
     <w:p>
@@ -1812,6 +1679,44 @@
           <w:sz w:val="20"/>
         </w:rPr>
         <w:t>Comité de durabilité opérationnel au niveau du CA</w:t>
+      </w:r>
+    </w:p>
+    <w:p>
+      <w:pPr>
+        <w:spacing w:after="60"/>
+        <w:ind w:left="283"/>
+      </w:pPr>
+      <w:r>
+        <w:rPr>
+          <w:color w:val="27AE60"/>
+          <w:sz w:val="20"/>
+        </w:rPr>
+        <w:t xml:space="preserve">✅  </w:t>
+      </w:r>
+      <w:r>
+        <w:rPr>
+          <w:sz w:val="20"/>
+        </w:rPr>
+        <w:t>Parité exemplaire au Conseil d'Administration (44%)</w:t>
+      </w:r>
+    </w:p>
+    <w:p>
+      <w:pPr>
+        <w:spacing w:after="60"/>
+        <w:ind w:left="283"/>
+      </w:pPr>
+      <w:r>
+        <w:rPr>
+          <w:color w:val="27AE60"/>
+          <w:sz w:val="20"/>
+        </w:rPr>
+        <w:t xml:space="preserve">✅  </w:t>
+      </w:r>
+      <w:r>
+        <w:rPr>
+          <w:sz w:val="20"/>
+        </w:rPr>
+        <w:t>Gouvernance de haute qualité et transparente</w:t>
       </w:r>
     </w:p>
     <w:p>
@@ -2152,7 +2057,7 @@
           <w:color w:val="2E86C1"/>
           <w:sz w:val="24"/>
         </w:rPr>
-        <w:t>Acme Industries surperforme son secteur de 9 points</w:t>
+        <w:t>Acme Industries surperforme son secteur de 11 points</w:t>
       </w:r>
     </w:p>
     <w:p>
@@ -2380,7 +2285,7 @@
               <w:rPr>
                 <w:sz w:val="19"/>
               </w:rPr>
-              <w:t>68</w:t>
+              <w:t>75</w:t>
             </w:r>
           </w:p>
         </w:tc>
@@ -2408,7 +2313,7 @@
                 <w:color w:val="2E7D32"/>
                 <w:sz w:val="19"/>
               </w:rPr>
-              <w:t>+10</w:t>
+              <w:t>+17</w:t>
             </w:r>
           </w:p>
         </w:tc>
@@ -2437,7 +2342,7 @@
               <w:rPr>
                 <w:sz w:val="19"/>
               </w:rPr>
-              <w:t>64</w:t>
+              <w:t>66</w:t>
             </w:r>
           </w:p>
         </w:tc>
@@ -2465,7 +2370,7 @@
                 <w:color w:val="2E7D32"/>
                 <w:sz w:val="19"/>
               </w:rPr>
-              <w:t>+9</w:t>
+              <w:t>+11</w:t>
             </w:r>
           </w:p>
         </w:tc>
@@ -3174,6 +3079,25 @@
         <w:rPr>
           <w:sz w:val="20"/>
         </w:rPr>
+        <w:t>Financement — Gouvernance solide : accès facilité aux financements ESG (green bonds, prêts indexés)</w:t>
+      </w:r>
+    </w:p>
+    <w:p>
+      <w:pPr>
+        <w:spacing w:after="60"/>
+        <w:ind w:left="283"/>
+      </w:pPr>
+      <w:r>
+        <w:rPr>
+          <w:color w:val="27AE60"/>
+          <w:sz w:val="20"/>
+        </w:rPr>
+        <w:t xml:space="preserve">▪  </w:t>
+      </w:r>
+      <w:r>
+        <w:rPr>
+          <w:sz w:val="20"/>
+        </w:rPr>
         <w:t>Financement — Activités alignées Taxonomie : éligibilité aux financements verts</w:t>
       </w:r>
     </w:p>
@@ -3213,25 +3137,6 @@
           <w:sz w:val="20"/>
         </w:rPr>
         <w:t>Talents — Politique sociale : marque employeur et rétention des talents renforcées</w:t>
-      </w:r>
-    </w:p>
-    <w:p>
-      <w:pPr>
-        <w:spacing w:after="60"/>
-        <w:ind w:left="283"/>
-      </w:pPr>
-      <w:r>
-        <w:rPr>
-          <w:color w:val="27AE60"/>
-          <w:sz w:val="20"/>
-        </w:rPr>
-        <w:t xml:space="preserve">▪  </w:t>
-      </w:r>
-      <w:r>
-        <w:rPr>
-          <w:sz w:val="20"/>
-        </w:rPr>
-        <w:t>Coûts — Économie circulaire : baisse des coûts matières et déchets</w:t>
       </w:r>
     </w:p>
     <w:p>
@@ -3397,7 +3302,7 @@
     </w:p>
     <w:p>
       <w:r>
-        <w:t>Fort d'un score ESG de 64.3/100 (BBB), Acme Industries amorce une dynamique positive sur l'ensemble des piliers ESG. L'analyse met en lumière trois points forts consolidés et cinq axes d'amélioration prioritaires. Portée par ces premiers résultats, Acme Industries structure une trajectoire de progrès sur les prochains exercices, en s'appuyant sur les 4 recommandations formulées comme feuille de route opérationnelle. L'organisation réaffirme son engagement envers un reporting transparent et rigoureux, en alignement avec les référentiels GRI Standards, TCFD, CSRD et les ODD des Nations Unies.</w:t>
+        <w:t>Fort d'un score ESG de 66.0/100 (A), Acme Industries amorce une dynamique positive sur l'ensemble des piliers ESG. L'analyse met en lumière cinq points forts consolidés et cinq axes d'amélioration prioritaires. Portée par ces premiers résultats, Acme Industries structure une trajectoire de progrès sur les prochains exercices, en s'appuyant sur les 4 recommandations formulées comme feuille de route opérationnelle. L'organisation réaffirme son engagement envers un reporting transparent et rigoureux, en alignement avec les référentiels GRI Standards, TCFD, CSRD et les ODD des Nations Unies.</w:t>
       </w:r>
     </w:p>
     <w:p>
@@ -3427,6 +3332,452 @@
         <w:t>Périmètre et méthodologie du reporting. Référentiel visé : CSRD / ESRS. Les indicateurs couvrent l'exercice 2025 selon l'approche du contrôle opérationnel. Les émissions de gaz à effet de serre sont calculées selon le GHG Protocol (Scopes 1, 2 et 3) ; les indicateurs sociaux suivent les définitions de la norme ESRS S1 ; les indicateurs de gouvernance sont documentés à partir des registres de l'entreprise. Les scores par pilier (0-100) agrègent chaque indicateur au regard des seuils réglementaires et des standards sectoriels reconnus — l'intensité carbone est notée sur une grille différenciée par famille sectorielle (services, industrie, transport, énergie…) ; le score global est la moyenne pondérée des trois piliers, et la notation lettrée (échelle interne AAA-CCC) est indicative — elle ne constitue pas une notation d'agence. La comparaison sectorielle s'appuie sur une base de référence interne du marché PME/ETI et n'implique aucun transfert de données externe — l'ensemble du rapport est produit localement. Limites : certains indicateurs reposent sur des données déclaratives et des estimations ; ils sont affinés à mesure que les dispositifs de mesure gagnent en maturité. Les points de données suivants restent à consolider : la vérification par un tiers indépendant, requise par la CSRD (assurance limitée).</w:t>
       </w:r>
     </w:p>
+    <w:p>
+      <w:pPr>
+        <w:spacing w:before="280" w:after="120"/>
+        <w:jc w:val="left"/>
+      </w:pPr>
+      <w:r>
+        <w:rPr>
+          <w:rFonts w:ascii="Calibri" w:hAnsi="Calibri"/>
+          <w:b/>
+          <w:color w:val="2E86C1"/>
+          <w:sz w:val="34"/>
+        </w:rPr>
+        <w:t>Glossaire</w:t>
+      </w:r>
+    </w:p>
+    <w:tbl>
+      <w:tblPr>
+        <w:tblStyle w:val="TableGrid"/>
+        <w:tblW w:type="auto" w:w="0"/>
+        <w:tblLook w:firstColumn="1" w:firstRow="1" w:lastColumn="0" w:lastRow="0" w:noHBand="0" w:noVBand="1" w:val="04A0"/>
+      </w:tblPr>
+      <w:tblGrid>
+        <w:gridCol w:w="4703"/>
+        <w:gridCol w:w="4703"/>
+      </w:tblGrid>
+      <w:tr>
+        <w:tc>
+          <w:tcPr>
+            <w:tcW w:type="dxa" w:w="4703"/>
+          </w:tcPr>
+          <w:p>
+            <w:r>
+              <w:rPr>
+                <w:b/>
+                <w:color w:val="1B3A6B"/>
+                <w:sz w:val="17"/>
+              </w:rPr>
+              <w:t>CSRD</w:t>
+            </w:r>
+          </w:p>
+        </w:tc>
+        <w:tc>
+          <w:tcPr>
+            <w:tcW w:type="dxa" w:w="4703"/>
+          </w:tcPr>
+          <w:p>
+            <w:r>
+              <w:rPr>
+                <w:sz w:val="17"/>
+              </w:rPr>
+              <w:t>Directive européenne sur la publication d'informations en matière de durabilité. Impose un reporting extra-financier normalisé et vérifié aux entreprises entrant dans son périmètre.</w:t>
+            </w:r>
+          </w:p>
+        </w:tc>
+      </w:tr>
+      <w:tr>
+        <w:tc>
+          <w:tcPr>
+            <w:tcW w:type="dxa" w:w="4703"/>
+          </w:tcPr>
+          <w:p>
+            <w:r>
+              <w:rPr>
+                <w:b/>
+                <w:color w:val="1B3A6B"/>
+                <w:sz w:val="17"/>
+              </w:rPr>
+              <w:t>ESRS</w:t>
+            </w:r>
+          </w:p>
+        </w:tc>
+        <w:tc>
+          <w:tcPr>
+            <w:tcW w:type="dxa" w:w="4703"/>
+          </w:tcPr>
+          <w:p>
+            <w:r>
+              <w:rPr>
+                <w:sz w:val="17"/>
+              </w:rPr>
+              <w:t>Normes techniques d'application de la CSRD. Elles précisent, thème par thème (climat, effectifs, conduite des affaires), les informations à publier.</w:t>
+            </w:r>
+          </w:p>
+        </w:tc>
+      </w:tr>
+      <w:tr>
+        <w:tc>
+          <w:tcPr>
+            <w:tcW w:type="dxa" w:w="4703"/>
+          </w:tcPr>
+          <w:p>
+            <w:r>
+              <w:rPr>
+                <w:b/>
+                <w:color w:val="1B3A6B"/>
+                <w:sz w:val="17"/>
+              </w:rPr>
+              <w:t>Double matérialité</w:t>
+            </w:r>
+          </w:p>
+        </w:tc>
+        <w:tc>
+          <w:tcPr>
+            <w:tcW w:type="dxa" w:w="4703"/>
+          </w:tcPr>
+          <w:p>
+            <w:r>
+              <w:rPr>
+                <w:sz w:val="17"/>
+              </w:rPr>
+              <w:t>Principe d'analyse retenant un enjeu s'il est significatif dans au moins un des deux sens : l'impact de l'entreprise sur son environnement, ou l'effet financier de cet enjeu sur l'entreprise.</w:t>
+            </w:r>
+          </w:p>
+        </w:tc>
+      </w:tr>
+      <w:tr>
+        <w:tc>
+          <w:tcPr>
+            <w:tcW w:type="dxa" w:w="4703"/>
+          </w:tcPr>
+          <w:p>
+            <w:r>
+              <w:rPr>
+                <w:b/>
+                <w:color w:val="1B3A6B"/>
+                <w:sz w:val="17"/>
+              </w:rPr>
+              <w:t>IRO</w:t>
+            </w:r>
+          </w:p>
+        </w:tc>
+        <w:tc>
+          <w:tcPr>
+            <w:tcW w:type="dxa" w:w="4703"/>
+          </w:tcPr>
+          <w:p>
+            <w:r>
+              <w:rPr>
+                <w:sz w:val="17"/>
+              </w:rPr>
+              <w:t>Impacts, Risques et Opportunités. Méthode de recensement et de cotation des enjeux qui structure l'analyse de double matérialité.</w:t>
+            </w:r>
+          </w:p>
+        </w:tc>
+      </w:tr>
+      <w:tr>
+        <w:tc>
+          <w:tcPr>
+            <w:tcW w:type="dxa" w:w="4703"/>
+          </w:tcPr>
+          <w:p>
+            <w:r>
+              <w:rPr>
+                <w:b/>
+                <w:color w:val="1B3A6B"/>
+                <w:sz w:val="17"/>
+              </w:rPr>
+              <w:t>Scopes 1, 2 et 3</w:t>
+            </w:r>
+          </w:p>
+        </w:tc>
+        <w:tc>
+          <w:tcPr>
+            <w:tcW w:type="dxa" w:w="4703"/>
+          </w:tcPr>
+          <w:p>
+            <w:r>
+              <w:rPr>
+                <w:sz w:val="17"/>
+              </w:rPr>
+              <w:t>Découpage des émissions de gaz à effet de serre : émissions directes (1), émissions liées à l'énergie achetée (2), et toutes les autres émissions de la chaîne de valeur, amont et aval (3).</w:t>
+            </w:r>
+          </w:p>
+        </w:tc>
+      </w:tr>
+      <w:tr>
+        <w:tc>
+          <w:tcPr>
+            <w:tcW w:type="dxa" w:w="4703"/>
+          </w:tcPr>
+          <w:p>
+            <w:r>
+              <w:rPr>
+                <w:b/>
+                <w:color w:val="1B3A6B"/>
+                <w:sz w:val="17"/>
+              </w:rPr>
+              <w:t>GHG Protocol</w:t>
+            </w:r>
+          </w:p>
+        </w:tc>
+        <w:tc>
+          <w:tcPr>
+            <w:tcW w:type="dxa" w:w="4703"/>
+          </w:tcPr>
+          <w:p>
+            <w:r>
+              <w:rPr>
+                <w:sz w:val="17"/>
+              </w:rPr>
+              <w:t>Référentiel international de comptabilisation des émissions de gaz à effet de serre, sur lequel repose le découpage en scopes.</w:t>
+            </w:r>
+          </w:p>
+        </w:tc>
+      </w:tr>
+      <w:tr>
+        <w:tc>
+          <w:tcPr>
+            <w:tcW w:type="dxa" w:w="4703"/>
+          </w:tcPr>
+          <w:p>
+            <w:r>
+              <w:rPr>
+                <w:b/>
+                <w:color w:val="1B3A6B"/>
+                <w:sz w:val="17"/>
+              </w:rPr>
+              <w:t>Intensité carbone</w:t>
+            </w:r>
+          </w:p>
+        </w:tc>
+        <w:tc>
+          <w:tcPr>
+            <w:tcW w:type="dxa" w:w="4703"/>
+          </w:tcPr>
+          <w:p>
+            <w:r>
+              <w:rPr>
+                <w:sz w:val="17"/>
+              </w:rPr>
+              <w:t>Émissions rapportées à l'activité, ici en tonnes de CO₂ équivalent par million d'euros de chiffre d'affaires. Permet de comparer des entreprises de tailles différentes.</w:t>
+            </w:r>
+          </w:p>
+        </w:tc>
+      </w:tr>
+      <w:tr>
+        <w:tc>
+          <w:tcPr>
+            <w:tcW w:type="dxa" w:w="4703"/>
+          </w:tcPr>
+          <w:p>
+            <w:r>
+              <w:rPr>
+                <w:b/>
+                <w:color w:val="1B3A6B"/>
+                <w:sz w:val="17"/>
+              </w:rPr>
+              <w:t>Taxonomie européenne</w:t>
+            </w:r>
+          </w:p>
+        </w:tc>
+        <w:tc>
+          <w:tcPr>
+            <w:tcW w:type="dxa" w:w="4703"/>
+          </w:tcPr>
+          <w:p>
+            <w:r>
+              <w:rPr>
+                <w:sz w:val="17"/>
+              </w:rPr>
+              <w:t>Classification des activités économiques durables. Une activité est « alignée » si elle contribue à un objectif environnemental sans nuire aux autres et respecte des garanties sociales minimales.</w:t>
+            </w:r>
+          </w:p>
+        </w:tc>
+      </w:tr>
+      <w:tr>
+        <w:tc>
+          <w:tcPr>
+            <w:tcW w:type="dxa" w:w="4703"/>
+          </w:tcPr>
+          <w:p>
+            <w:r>
+              <w:rPr>
+                <w:b/>
+                <w:color w:val="1B3A6B"/>
+                <w:sz w:val="17"/>
+              </w:rPr>
+              <w:t>DNSH</w:t>
+            </w:r>
+          </w:p>
+        </w:tc>
+        <w:tc>
+          <w:tcPr>
+            <w:tcW w:type="dxa" w:w="4703"/>
+          </w:tcPr>
+          <w:p>
+            <w:r>
+              <w:rPr>
+                <w:sz w:val="17"/>
+              </w:rPr>
+              <w:t>« Do No Significant Harm ». Condition de la Taxonomie : contribuer à un objectif environnemental sans causer de préjudice important aux autres.</w:t>
+            </w:r>
+          </w:p>
+        </w:tc>
+      </w:tr>
+      <w:tr>
+        <w:tc>
+          <w:tcPr>
+            <w:tcW w:type="dxa" w:w="4703"/>
+          </w:tcPr>
+          <w:p>
+            <w:r>
+              <w:rPr>
+                <w:b/>
+                <w:color w:val="1B3A6B"/>
+                <w:sz w:val="17"/>
+              </w:rPr>
+              <w:t>TCFD</w:t>
+            </w:r>
+          </w:p>
+        </w:tc>
+        <w:tc>
+          <w:tcPr>
+            <w:tcW w:type="dxa" w:w="4703"/>
+          </w:tcPr>
+          <w:p>
+            <w:r>
+              <w:rPr>
+                <w:sz w:val="17"/>
+              </w:rPr>
+              <w:t>Cadre de publication des risques financiers liés au climat, structuré autour de la gouvernance, de la stratégie, de la gestion des risques et des indicateurs.</w:t>
+            </w:r>
+          </w:p>
+        </w:tc>
+      </w:tr>
+      <w:tr>
+        <w:tc>
+          <w:tcPr>
+            <w:tcW w:type="dxa" w:w="4703"/>
+          </w:tcPr>
+          <w:p>
+            <w:r>
+              <w:rPr>
+                <w:b/>
+                <w:color w:val="1B3A6B"/>
+                <w:sz w:val="17"/>
+              </w:rPr>
+              <w:t>SBTi</w:t>
+            </w:r>
+          </w:p>
+        </w:tc>
+        <w:tc>
+          <w:tcPr>
+            <w:tcW w:type="dxa" w:w="4703"/>
+          </w:tcPr>
+          <w:p>
+            <w:r>
+              <w:rPr>
+                <w:sz w:val="17"/>
+              </w:rPr>
+              <w:t>Science Based Targets initiative. Méthodologie de définition d'objectifs de réduction d'émissions compatibles avec la trajectoire de l'Accord de Paris.</w:t>
+            </w:r>
+          </w:p>
+        </w:tc>
+      </w:tr>
+      <w:tr>
+        <w:tc>
+          <w:tcPr>
+            <w:tcW w:type="dxa" w:w="4703"/>
+          </w:tcPr>
+          <w:p>
+            <w:r>
+              <w:rPr>
+                <w:b/>
+                <w:color w:val="1B3A6B"/>
+                <w:sz w:val="17"/>
+              </w:rPr>
+              <w:t>Assurance limitée</w:t>
+            </w:r>
+          </w:p>
+        </w:tc>
+        <w:tc>
+          <w:tcPr>
+            <w:tcW w:type="dxa" w:w="4703"/>
+          </w:tcPr>
+          <w:p>
+            <w:r>
+              <w:rPr>
+                <w:sz w:val="17"/>
+              </w:rPr>
+              <w:t>Niveau de vérification par un tiers indépendant requis par la CSRD : le vérificateur conclut qu'il n'a pas relevé d'anomalie significative, sans l'audit approfondi que suppose une assurance raisonnable.</w:t>
+            </w:r>
+          </w:p>
+        </w:tc>
+      </w:tr>
+      <w:tr>
+        <w:tc>
+          <w:tcPr>
+            <w:tcW w:type="dxa" w:w="4703"/>
+          </w:tcPr>
+          <w:p>
+            <w:r>
+              <w:rPr>
+                <w:b/>
+                <w:color w:val="1B3A6B"/>
+                <w:sz w:val="17"/>
+              </w:rPr>
+              <w:t>ODD</w:t>
+            </w:r>
+          </w:p>
+        </w:tc>
+        <w:tc>
+          <w:tcPr>
+            <w:tcW w:type="dxa" w:w="4703"/>
+          </w:tcPr>
+          <w:p>
+            <w:r>
+              <w:rPr>
+                <w:sz w:val="17"/>
+              </w:rPr>
+              <w:t>Les 17 Objectifs de développement durable des Nations unies, utilisés comme grille de lecture universelle de la contribution d'une organisation.</w:t>
+            </w:r>
+          </w:p>
+        </w:tc>
+      </w:tr>
+      <w:tr>
+        <w:tc>
+          <w:tcPr>
+            <w:tcW w:type="dxa" w:w="4703"/>
+          </w:tcPr>
+          <w:p>
+            <w:r>
+              <w:rPr>
+                <w:b/>
+                <w:color w:val="1B3A6B"/>
+                <w:sz w:val="17"/>
+              </w:rPr>
+              <w:t>GRI</w:t>
+            </w:r>
+          </w:p>
+        </w:tc>
+        <w:tc>
+          <w:tcPr>
+            <w:tcW w:type="dxa" w:w="4703"/>
+          </w:tcPr>
+          <w:p>
+            <w:r>
+              <w:rPr>
+                <w:sz w:val="17"/>
+              </w:rPr>
+              <w:t>Global Reporting Initiative : référentiel international de reporting de durabilité, largement utilisé et compatible avec les ESRS.</w:t>
+            </w:r>
+          </w:p>
+        </w:tc>
+      </w:tr>
+    </w:tbl>
     <w:p/>
     <w:p>
       <w:pPr>

</xml_diff>

<commit_message>
Revert "T2 + T1 : le silence ne produit plus de jugement, et la completude est publiee"
This reverts commit ed06e41.

Arret demande : le chantier est passe d'un patch cible a un changement
transverse, et l'ampleur avait ete sous-estimee d'un facteur quatre --
26 sites de formatage annonces au diagnostic, 119 sites constates a
l'implementation. Le garde unique introduit en entree de
generate_esg_content et la propagation de l'absence a travers 12 fichiers
backend et 3 frontend sont une decision d'architecture, pas la suite de ce
qui avait ete valide.

Le commit annule etait pousse : un checkout ou un stash ne pouvait pas le
defaire, d'ou ce revert plutot qu'une reecriture d'historique.

Etat conserve : 9bc2439, qui porte les deux tests de demonstration (temoin
fige et invariant cible en xfail strict) sans aucun traitement. C'est le
bon point de reprise.

Co-Authored-By: Claude Opus 5 <noreply@anthropic.com>
</commit_message>
<xml_diff>
--- a/examples/Rapport-ESG.docx
+++ b/examples/Rapport-ESG.docx
@@ -165,7 +165,7 @@
                 <w:color w:val="27AE60"/>
                 <w:sz w:val="48"/>
               </w:rPr>
-              <w:t>70</w:t>
+              <w:t>70.0</w:t>
             </w:r>
           </w:p>
         </w:tc>
@@ -183,7 +183,7 @@
                 <w:color w:val="2E86C1"/>
                 <w:sz w:val="48"/>
               </w:rPr>
-              <w:t>55</w:t>
+              <w:t>55.0</w:t>
             </w:r>
           </w:p>
         </w:tc>
@@ -201,7 +201,7 @@
                 <w:color w:val="8E44AD"/>
                 <w:sz w:val="48"/>
               </w:rPr>
-              <w:t>75</w:t>
+              <w:t>75.0</w:t>
             </w:r>
           </w:p>
         </w:tc>
@@ -219,7 +219,7 @@
                 <w:color w:val="F39C12"/>
                 <w:sz w:val="48"/>
               </w:rPr>
-              <w:t>66</w:t>
+              <w:t>66.0</w:t>
             </w:r>
           </w:p>
         </w:tc>
@@ -3243,7 +3243,7 @@
           <w:color w:val="5A6572"/>
           <w:sz w:val="17"/>
         </w:rPr>
-        <w:t>Périmètre et méthodologie du reporting. Référentiel visé : CSRD / ESRS. Les indicateurs couvrent l'exercice 2025 selon l'approche du contrôle opérationnel. Les émissions de gaz à effet de serre sont calculées selon le GHG Protocol (Scopes 1, 2 et 3) ; les indicateurs sociaux suivent les définitions de la norme ESRS S1 ; les indicateurs de gouvernance sont documentés à partir des registres de l'entreprise. Les scores par pilier (0-100) agrègent chaque indicateur sur une GRILLE DE NOTATION INTERNE, propre à l'outil : ses seuils ont été définis en interne et ne sont adossés à aucun référentiel externe publié. L'intensité carbone est notée sur une grille différenciée par famille sectorielle (services, industrie, transport, énergie…), elle aussi interne. Le score global est la moyenne pondérée des trois piliers, et la notation lettrée (échelle interne AAA-CCC) est indicative — elle ne constitue pas une notation d'agence. Le rapport ne comporte aucune comparaison à un référentiel sectoriel externe : le positionnement présenté est interne, il compare les trois piliers entre eux. Aucun transfert de données externe n'a lieu — l'ensemble du rapport est produit localement. Périmètre : ce rapport documente les indicateurs collectés pour l'exercice — bilan d'émissions par scope, indicateurs sociaux et de gouvernance, et parts déclarées comme alignées à la Taxonomie UE lorsqu'elles sont renseignées. Il ne constitue ni une vérification par un tiers, ni une déclaration de conformité à un cadre de reporting, ni un engagement de l'organisation. Limites : certains indicateurs reposent sur des données déclaratives et des estimations ; ils sont affinés à mesure que les dispositifs de mesure gagnent en maturité. Le questionnaire collecte 29 indicateurs ; 18 entrent dans le calcul du score, les 11 autres sont publiés dans le rapport sans y contribuer. Pour cet exercice, le score est calculé sur 14 des 18 indicateurs du barème. Les points de données suivants restent à consolider : la vérification par un tiers indépendant, requise par la CSRD (assurance limitée).</w:t>
+        <w:t>Périmètre et méthodologie du reporting. Référentiel visé : CSRD / ESRS. Les indicateurs couvrent l'exercice 2025 selon l'approche du contrôle opérationnel. Les émissions de gaz à effet de serre sont calculées selon le GHG Protocol (Scopes 1, 2 et 3) ; les indicateurs sociaux suivent les définitions de la norme ESRS S1 ; les indicateurs de gouvernance sont documentés à partir des registres de l'entreprise. Les scores par pilier (0-100) agrègent chaque indicateur sur une GRILLE DE NOTATION INTERNE, propre à l'outil : ses seuils ont été définis en interne et ne sont adossés à aucun référentiel externe publié. L'intensité carbone est notée sur une grille différenciée par famille sectorielle (services, industrie, transport, énergie…), elle aussi interne. Le score global est la moyenne pondérée des trois piliers, et la notation lettrée (échelle interne AAA-CCC) est indicative — elle ne constitue pas une notation d'agence. Le rapport ne comporte aucune comparaison à un référentiel sectoriel externe : le positionnement présenté est interne, il compare les trois piliers entre eux. Aucun transfert de données externe n'a lieu — l'ensemble du rapport est produit localement. Périmètre : ce rapport documente les indicateurs collectés pour l'exercice — bilan d'émissions par scope, indicateurs sociaux et de gouvernance, et parts déclarées comme alignées à la Taxonomie UE lorsqu'elles sont renseignées. Il ne constitue ni une vérification par un tiers, ni une déclaration de conformité à un cadre de reporting, ni un engagement de l'organisation. Limites : certains indicateurs reposent sur des données déclaratives et des estimations ; ils sont affinés à mesure que les dispositifs de mesure gagnent en maturité. Les points de données suivants restent à consolider : la vérification par un tiers indépendant, requise par la CSRD (assurance limitée).</w:t>
       </w:r>
     </w:p>
     <w:p>

</xml_diff>